<commit_message>
docs(evidence): refresh PostgreSQL-backed flow captures
Document the seeded category data, DB-backed classification result, and current scope limitations.

Co-authored-by: Copilot <223556219+Copilot@users.noreply.github.com>
</commit_message>
<xml_diff>
--- a/docs/Phu_luc_minh_chung_luong_prototype.docx
+++ b/docs/Phu_luc_minh_chung_luong_prototype.docx
@@ -35,22 +35,27 @@
         <w:pStyle w:val="Heading1"/>
       </w:pPr>
       <w:r>
-        <w:t>Phạm vi và điều kiện kiểm thử</w:t>
+        <w:t>Phạm vi và kết quả kiểm chứng</w:t>
       </w:r>
     </w:p>
     <w:p>
       <w:r>
-        <w:t>Các ảnh chụp trực tiếp giao diện prototype gồm đăng nhập, phân loại mô tả sự cố và đăng xuất. Chúng minh chứng các trạng thái đang tải, rỗng và lỗi của giao diện. Tra cứu khách hàng, tạo phiếu, danh sách phiếu và cập nhật trạng thái chưa được triển khai.</w:t>
+        <w:t>Kiểm thử cục bộ ngày 24/10/2026 trên PostgreSQL 18.6. Cơ sở dữ liệu smart_crm_l2 ban đầu trống; đã áp dụng db/schema.sql và nạp db/seed.sql gồm sáu nhóm sự cố cùng mức ưu tiên. Luồng đăng nhập và phân loại mô tả đã chạy qua API thật; kết quả kiểm tra “Máy sạc không vào, cắm sạc báo lỗi phụ kiện” là SAC / TRUNG_BINH.</w:t>
       </w:r>
     </w:p>
     <w:p>
       <w:r>
-        <w:t>Kiểm thử giao diện cục bộ ngày 23/10/2026. Vì DATABASE_URL chưa kết nối được tới PostgreSQL, lần chụp dùng bộ danh mục giả lập trong bộ nhớ; kết quả ảnh không phải bằng chứng chạy trên dữ liệu PostgreSQL thật. Không có mật khẩu hoặc access token nào được lưu trong tài liệu.</w:t>
+        <w:t>Ảnh trạng thái đang tải dùng độ trễ kiểm thử 1,5 giây trước khi repository truy vấn PostgreSQL, chỉ để lưu được trạng thái giao diện tạm thời. Phản hồi phân loại thành công vẫn đọc từ danh mục trong PostgreSQL; không dùng repository giả lập trong lần chụp này.</w:t>
       </w:r>
     </w:p>
     <w:p>
       <w:r>
-        <w:t>Ảnh PNG riêng được lưu trong thư mục docs/screenshots/.</w:t>
+        <w:t>Giới hạn: database hiện chỉ có dữ liệu danh mục được seed, chưa có bộ mẫu khách hàng/thiết bị/phiếu. Vì vậy ảnh và kiểm thử này chứng minh luồng đăng nhập/phân loại với dữ liệu danh mục thật, không chứng minh luồng nghiệp vụ khách hàng hoặc phiếu bảo hành đã chạy.</w:t>
+      </w:r>
+    </w:p>
+    <w:p>
+      <w:r>
+        <w:t>Đã chạy toàn bộ test sau khi clone repo sạch: 26 passed, gồm 11 test ràng buộc PostgreSQL; không có test bị skip. Ảnh PNG riêng nằm trong docs/screenshots/.</w:t>
       </w:r>
     </w:p>
     <w:p>
@@ -58,7 +63,7 @@
         <w:pStyle w:val="Heading1"/>
       </w:pPr>
       <w:r>
-        <w:t>Các trạng thái được kiểm tra</w:t>
+        <w:t>Các trạng thái được chụp</w:t>
       </w:r>
     </w:p>
     <w:p>
@@ -66,7 +71,7 @@
         <w:pStyle w:val="ListBullet"/>
       </w:pPr>
       <w:r>
-        <w:t>1. Màn hình đăng nhập: Trang đăng nhập của prototype trước khi xác thực.</w:t>
+        <w:t>1. Màn hình đăng nhập: Giao diện đăng nhập trước khi xác thực.</w:t>
       </w:r>
     </w:p>
     <w:p>
@@ -74,7 +79,7 @@
         <w:pStyle w:val="ListBullet"/>
       </w:pPr>
       <w:r>
-        <w:t>2. Đăng nhập thất bại: Thông tin đăng nhập sai được từ chối; giao diện hiển thị lỗi.</w:t>
+        <w:t>2. Đăng nhập thất bại: Từ chối thông tin không hợp lệ và hiển thị lỗi cho người dùng.</w:t>
       </w:r>
     </w:p>
     <w:p>
@@ -82,7 +87,7 @@
         <w:pStyle w:val="ListBullet"/>
       </w:pPr>
       <w:r>
-        <w:t>3. Đăng nhập thành công và trạng thái rỗng: Sau xác thực, vùng kết quả có hướng dẫn trước khi người dùng gửi mô tả sự cố.</w:t>
+        <w:t>3. Đăng nhập thành công — trạng thái rỗng: Sau xác thực, vùng kết quả hướng dẫn người dùng nhập mô tả trước khi gửi.</w:t>
       </w:r>
     </w:p>
     <w:p>
@@ -90,7 +95,7 @@
         <w:pStyle w:val="ListBullet"/>
       </w:pPr>
       <w:r>
-        <w:t>4. Đang xử lý yêu cầu phân loại: Trong khi chờ phản hồi API, giao diện hiển thị trạng thái đang gửi và khóa nút thao tác.</w:t>
+        <w:t>4. Đang xử lý phân loại: Trạng thái tải xuất hiện trong lúc chờ truy vấn danh mục PostgreSQL; độ trễ kiểm thử chỉ dùng để làm trạng thái tạm thời dễ quan sát.</w:t>
       </w:r>
     </w:p>
     <w:p>
@@ -98,7 +103,7 @@
         <w:pStyle w:val="ListBullet"/>
       </w:pPr>
       <w:r>
-        <w:t>5. Phân loại thành công: Mô tả “Máy sạc không vào, cắm sạc báo lỗi phụ kiện” trả đề xuất SAC, ưu tiên TRUNG_BINH.</w:t>
+        <w:t>5. Phân loại thành công trên PostgreSQL: Mô tả “Máy sạc không vào, cắm sạc báo lỗi phụ kiện” được phân loại SAC, ưu tiên TRUNG_BINH từ danh mục PostgreSQL đã seed.</w:t>
       </w:r>
     </w:p>
     <w:p>
@@ -106,7 +111,7 @@
         <w:pStyle w:val="ListBullet"/>
       </w:pPr>
       <w:r>
-        <w:t>6. Mô tả không hợp lệ: Mô tả ngắn bị từ chối và giao diện hiển thị phản hồi lỗi validation.</w:t>
+        <w:t>6. Mô tả không hợp lệ: Mô tả ngắn bị API từ chối và giao diện hiển thị lỗi validation.</w:t>
       </w:r>
     </w:p>
     <w:p>
@@ -114,7 +119,7 @@
         <w:pStyle w:val="ListBullet"/>
       </w:pPr>
       <w:r>
-        <w:t>7. Đăng xuất: Đăng xuất xóa phiên trình duyệt và đưa người dùng về màn hình đăng nhập.</w:t>
+        <w:t>7. Đăng xuất: Đăng xuất xóa phiên trình duyệt và quay về màn hình đăng nhập.</w:t>
       </w:r>
     </w:p>
     <w:p>
@@ -132,14 +137,14 @@
     </w:p>
     <w:p>
       <w:r>
-        <w:t>Trang đăng nhập của prototype trước khi xác thực.</w:t>
+        <w:t>Giao diện đăng nhập trước khi xác thực.</w:t>
       </w:r>
     </w:p>
     <w:p>
       <w:r>
         <w:drawing>
           <wp:inline xmlns:a="http://schemas.openxmlformats.org/drawingml/2006/main" xmlns:pic="http://schemas.openxmlformats.org/drawingml/2006/picture">
-            <wp:extent cx="5897880" cy="6516631"/>
+            <wp:extent cx="5943600" cy="4209854"/>
             <wp:docPr id="1" name="Picture 1"/>
             <wp:cNvGraphicFramePr>
               <a:graphicFrameLocks noChangeAspect="1"/>
@@ -160,7 +165,7 @@
                   <pic:spPr>
                     <a:xfrm>
                       <a:off x="0" y="0"/>
-                      <a:ext cx="5897880" cy="6516631"/>
+                      <a:ext cx="5943600" cy="4209854"/>
                     </a:xfrm>
                     <a:prstGeom prst="rect"/>
                   </pic:spPr>
@@ -180,7 +185,7 @@
           <w:i/>
           <w:sz w:val="18"/>
         </w:rPr>
-        <w:t>Ảnh chụp giao diện prototype: docs/screenshots/01-login.png</w:t>
+        <w:t>Ảnh chụp prototype cục bộ: docs/screenshots/01-login.png</w:t>
       </w:r>
     </w:p>
     <w:p>
@@ -198,15 +203,345 @@
     </w:p>
     <w:p>
       <w:r>
-        <w:t>Thông tin đăng nhập sai được từ chối; giao diện hiển thị lỗi.</w:t>
+        <w:t>Từ chối thông tin không hợp lệ và hiển thị lỗi cho người dùng.</w:t>
       </w:r>
     </w:p>
     <w:p>
       <w:r>
         <w:drawing>
           <wp:inline xmlns:a="http://schemas.openxmlformats.org/drawingml/2006/main" xmlns:pic="http://schemas.openxmlformats.org/drawingml/2006/picture">
-            <wp:extent cx="5897880" cy="6516631"/>
+            <wp:extent cx="5943600" cy="4209854"/>
             <wp:docPr id="2" name="Picture 2"/>
+            <wp:cNvGraphicFramePr>
+              <a:graphicFrameLocks noChangeAspect="1"/>
+            </wp:cNvGraphicFramePr>
+            <a:graphic>
+              <a:graphicData uri="http://schemas.openxmlformats.org/drawingml/2006/picture">
+                <pic:pic>
+                  <pic:nvPicPr>
+                    <pic:cNvPr id="0" name="02-login-failed.png"/>
+                    <pic:cNvPicPr/>
+                  </pic:nvPicPr>
+                  <pic:blipFill>
+                    <a:blip r:embed="rId10"/>
+                    <a:stretch>
+                      <a:fillRect/>
+                    </a:stretch>
+                  </pic:blipFill>
+                  <pic:spPr>
+                    <a:xfrm>
+                      <a:off x="0" y="0"/>
+                      <a:ext cx="5943600" cy="4209854"/>
+                    </a:xfrm>
+                    <a:prstGeom prst="rect"/>
+                  </pic:spPr>
+                </pic:pic>
+              </a:graphicData>
+            </a:graphic>
+          </wp:inline>
+        </w:drawing>
+      </w:r>
+    </w:p>
+    <w:p>
+      <w:pPr>
+        <w:jc w:val="center"/>
+      </w:pPr>
+      <w:r>
+        <w:rPr>
+          <w:i/>
+          <w:sz w:val="18"/>
+        </w:rPr>
+        <w:t>Ảnh chụp prototype cục bộ: docs/screenshots/02-login-failed.png</w:t>
+      </w:r>
+    </w:p>
+    <w:p>
+      <w:r>
+        <w:br w:type="page"/>
+      </w:r>
+    </w:p>
+    <w:p>
+      <w:pPr>
+        <w:pStyle w:val="Heading1"/>
+      </w:pPr>
+      <w:r>
+        <w:t>3. Đăng nhập thành công — trạng thái rỗng</w:t>
+      </w:r>
+    </w:p>
+    <w:p>
+      <w:r>
+        <w:t>Sau xác thực, vùng kết quả hướng dẫn người dùng nhập mô tả trước khi gửi.</w:t>
+      </w:r>
+    </w:p>
+    <w:p>
+      <w:r>
+        <w:drawing>
+          <wp:inline xmlns:a="http://schemas.openxmlformats.org/drawingml/2006/main" xmlns:pic="http://schemas.openxmlformats.org/drawingml/2006/picture">
+            <wp:extent cx="5943600" cy="4209854"/>
+            <wp:docPr id="3" name="Picture 3"/>
+            <wp:cNvGraphicFramePr>
+              <a:graphicFrameLocks noChangeAspect="1"/>
+            </wp:cNvGraphicFramePr>
+            <a:graphic>
+              <a:graphicData uri="http://schemas.openxmlformats.org/drawingml/2006/picture">
+                <pic:pic>
+                  <pic:nvPicPr>
+                    <pic:cNvPr id="0" name="03-login-success-empty.png"/>
+                    <pic:cNvPicPr/>
+                  </pic:nvPicPr>
+                  <pic:blipFill>
+                    <a:blip r:embed="rId11"/>
+                    <a:stretch>
+                      <a:fillRect/>
+                    </a:stretch>
+                  </pic:blipFill>
+                  <pic:spPr>
+                    <a:xfrm>
+                      <a:off x="0" y="0"/>
+                      <a:ext cx="5943600" cy="4209854"/>
+                    </a:xfrm>
+                    <a:prstGeom prst="rect"/>
+                  </pic:spPr>
+                </pic:pic>
+              </a:graphicData>
+            </a:graphic>
+          </wp:inline>
+        </w:drawing>
+      </w:r>
+    </w:p>
+    <w:p>
+      <w:pPr>
+        <w:jc w:val="center"/>
+      </w:pPr>
+      <w:r>
+        <w:rPr>
+          <w:i/>
+          <w:sz w:val="18"/>
+        </w:rPr>
+        <w:t>Ảnh chụp prototype cục bộ: docs/screenshots/03-login-success-empty.png</w:t>
+      </w:r>
+    </w:p>
+    <w:p>
+      <w:r>
+        <w:br w:type="page"/>
+      </w:r>
+    </w:p>
+    <w:p>
+      <w:pPr>
+        <w:pStyle w:val="Heading1"/>
+      </w:pPr>
+      <w:r>
+        <w:t>4. Đang xử lý phân loại</w:t>
+      </w:r>
+    </w:p>
+    <w:p>
+      <w:r>
+        <w:t>Trạng thái tải xuất hiện trong lúc chờ truy vấn danh mục PostgreSQL; độ trễ kiểm thử chỉ dùng để làm trạng thái tạm thời dễ quan sát.</w:t>
+      </w:r>
+    </w:p>
+    <w:p>
+      <w:r>
+        <w:drawing>
+          <wp:inline xmlns:a="http://schemas.openxmlformats.org/drawingml/2006/main" xmlns:pic="http://schemas.openxmlformats.org/drawingml/2006/picture">
+            <wp:extent cx="5943600" cy="4209854"/>
+            <wp:docPr id="4" name="Picture 4"/>
+            <wp:cNvGraphicFramePr>
+              <a:graphicFrameLocks noChangeAspect="1"/>
+            </wp:cNvGraphicFramePr>
+            <a:graphic>
+              <a:graphicData uri="http://schemas.openxmlformats.org/drawingml/2006/picture">
+                <pic:pic>
+                  <pic:nvPicPr>
+                    <pic:cNvPr id="0" name="04-classification-loading.png"/>
+                    <pic:cNvPicPr/>
+                  </pic:nvPicPr>
+                  <pic:blipFill>
+                    <a:blip r:embed="rId12"/>
+                    <a:stretch>
+                      <a:fillRect/>
+                    </a:stretch>
+                  </pic:blipFill>
+                  <pic:spPr>
+                    <a:xfrm>
+                      <a:off x="0" y="0"/>
+                      <a:ext cx="5943600" cy="4209854"/>
+                    </a:xfrm>
+                    <a:prstGeom prst="rect"/>
+                  </pic:spPr>
+                </pic:pic>
+              </a:graphicData>
+            </a:graphic>
+          </wp:inline>
+        </w:drawing>
+      </w:r>
+    </w:p>
+    <w:p>
+      <w:pPr>
+        <w:jc w:val="center"/>
+      </w:pPr>
+      <w:r>
+        <w:rPr>
+          <w:i/>
+          <w:sz w:val="18"/>
+        </w:rPr>
+        <w:t>Ảnh chụp prototype cục bộ: docs/screenshots/04-classification-loading.png</w:t>
+      </w:r>
+    </w:p>
+    <w:p>
+      <w:r>
+        <w:br w:type="page"/>
+      </w:r>
+    </w:p>
+    <w:p>
+      <w:pPr>
+        <w:pStyle w:val="Heading1"/>
+      </w:pPr>
+      <w:r>
+        <w:t>5. Phân loại thành công trên PostgreSQL</w:t>
+      </w:r>
+    </w:p>
+    <w:p>
+      <w:r>
+        <w:t>Mô tả “Máy sạc không vào, cắm sạc báo lỗi phụ kiện” được phân loại SAC, ưu tiên TRUNG_BINH từ danh mục PostgreSQL đã seed.</w:t>
+      </w:r>
+    </w:p>
+    <w:p>
+      <w:r>
+        <w:drawing>
+          <wp:inline xmlns:a="http://schemas.openxmlformats.org/drawingml/2006/main" xmlns:pic="http://schemas.openxmlformats.org/drawingml/2006/picture">
+            <wp:extent cx="5943600" cy="4209854"/>
+            <wp:docPr id="5" name="Picture 5"/>
+            <wp:cNvGraphicFramePr>
+              <a:graphicFrameLocks noChangeAspect="1"/>
+            </wp:cNvGraphicFramePr>
+            <a:graphic>
+              <a:graphicData uri="http://schemas.openxmlformats.org/drawingml/2006/picture">
+                <pic:pic>
+                  <pic:nvPicPr>
+                    <pic:cNvPr id="0" name="05-classification-success.png"/>
+                    <pic:cNvPicPr/>
+                  </pic:nvPicPr>
+                  <pic:blipFill>
+                    <a:blip r:embed="rId13"/>
+                    <a:stretch>
+                      <a:fillRect/>
+                    </a:stretch>
+                  </pic:blipFill>
+                  <pic:spPr>
+                    <a:xfrm>
+                      <a:off x="0" y="0"/>
+                      <a:ext cx="5943600" cy="4209854"/>
+                    </a:xfrm>
+                    <a:prstGeom prst="rect"/>
+                  </pic:spPr>
+                </pic:pic>
+              </a:graphicData>
+            </a:graphic>
+          </wp:inline>
+        </w:drawing>
+      </w:r>
+    </w:p>
+    <w:p>
+      <w:pPr>
+        <w:jc w:val="center"/>
+      </w:pPr>
+      <w:r>
+        <w:rPr>
+          <w:i/>
+          <w:sz w:val="18"/>
+        </w:rPr>
+        <w:t>Ảnh chụp prototype cục bộ: docs/screenshots/05-classification-success.png</w:t>
+      </w:r>
+    </w:p>
+    <w:p>
+      <w:r>
+        <w:br w:type="page"/>
+      </w:r>
+    </w:p>
+    <w:p>
+      <w:pPr>
+        <w:pStyle w:val="Heading1"/>
+      </w:pPr>
+      <w:r>
+        <w:t>6. Mô tả không hợp lệ</w:t>
+      </w:r>
+    </w:p>
+    <w:p>
+      <w:r>
+        <w:t>Mô tả ngắn bị API từ chối và giao diện hiển thị lỗi validation.</w:t>
+      </w:r>
+    </w:p>
+    <w:p>
+      <w:r>
+        <w:drawing>
+          <wp:inline xmlns:a="http://schemas.openxmlformats.org/drawingml/2006/main" xmlns:pic="http://schemas.openxmlformats.org/drawingml/2006/picture">
+            <wp:extent cx="5943600" cy="4209854"/>
+            <wp:docPr id="6" name="Picture 6"/>
+            <wp:cNvGraphicFramePr>
+              <a:graphicFrameLocks noChangeAspect="1"/>
+            </wp:cNvGraphicFramePr>
+            <a:graphic>
+              <a:graphicData uri="http://schemas.openxmlformats.org/drawingml/2006/picture">
+                <pic:pic>
+                  <pic:nvPicPr>
+                    <pic:cNvPr id="0" name="06-classification-error.png"/>
+                    <pic:cNvPicPr/>
+                  </pic:nvPicPr>
+                  <pic:blipFill>
+                    <a:blip r:embed="rId14"/>
+                    <a:stretch>
+                      <a:fillRect/>
+                    </a:stretch>
+                  </pic:blipFill>
+                  <pic:spPr>
+                    <a:xfrm>
+                      <a:off x="0" y="0"/>
+                      <a:ext cx="5943600" cy="4209854"/>
+                    </a:xfrm>
+                    <a:prstGeom prst="rect"/>
+                  </pic:spPr>
+                </pic:pic>
+              </a:graphicData>
+            </a:graphic>
+          </wp:inline>
+        </w:drawing>
+      </w:r>
+    </w:p>
+    <w:p>
+      <w:pPr>
+        <w:jc w:val="center"/>
+      </w:pPr>
+      <w:r>
+        <w:rPr>
+          <w:i/>
+          <w:sz w:val="18"/>
+        </w:rPr>
+        <w:t>Ảnh chụp prototype cục bộ: docs/screenshots/06-classification-error.png</w:t>
+      </w:r>
+    </w:p>
+    <w:p>
+      <w:r>
+        <w:br w:type="page"/>
+      </w:r>
+    </w:p>
+    <w:p>
+      <w:pPr>
+        <w:pStyle w:val="Heading1"/>
+      </w:pPr>
+      <w:r>
+        <w:t>7. Đăng xuất</w:t>
+      </w:r>
+    </w:p>
+    <w:p>
+      <w:r>
+        <w:t>Đăng xuất xóa phiên trình duyệt và quay về màn hình đăng nhập.</w:t>
+      </w:r>
+    </w:p>
+    <w:p>
+      <w:r>
+        <w:drawing>
+          <wp:inline xmlns:a="http://schemas.openxmlformats.org/drawingml/2006/main" xmlns:pic="http://schemas.openxmlformats.org/drawingml/2006/picture">
+            <wp:extent cx="5943600" cy="4209854"/>
+            <wp:docPr id="7" name="Picture 7"/>
             <wp:cNvGraphicFramePr>
               <a:graphicFrameLocks noChangeAspect="1"/>
             </wp:cNvGraphicFramePr>
@@ -226,7 +561,7 @@
                   <pic:spPr>
                     <a:xfrm>
                       <a:off x="0" y="0"/>
-                      <a:ext cx="5897880" cy="6516631"/>
+                      <a:ext cx="5943600" cy="4209854"/>
                     </a:xfrm>
                     <a:prstGeom prst="rect"/>
                   </pic:spPr>
@@ -246,337 +581,7 @@
           <w:i/>
           <w:sz w:val="18"/>
         </w:rPr>
-        <w:t>Ảnh chụp giao diện prototype: docs/screenshots/02-login-failed.png</w:t>
-      </w:r>
-    </w:p>
-    <w:p>
-      <w:r>
-        <w:br w:type="page"/>
-      </w:r>
-    </w:p>
-    <w:p>
-      <w:pPr>
-        <w:pStyle w:val="Heading1"/>
-      </w:pPr>
-      <w:r>
-        <w:t>3. Đăng nhập thành công và trạng thái rỗng</w:t>
-      </w:r>
-    </w:p>
-    <w:p>
-      <w:r>
-        <w:t>Sau xác thực, vùng kết quả có hướng dẫn trước khi người dùng gửi mô tả sự cố.</w:t>
-      </w:r>
-    </w:p>
-    <w:p>
-      <w:r>
-        <w:drawing>
-          <wp:inline xmlns:a="http://schemas.openxmlformats.org/drawingml/2006/main" xmlns:pic="http://schemas.openxmlformats.org/drawingml/2006/picture">
-            <wp:extent cx="5897880" cy="6681192"/>
-            <wp:docPr id="3" name="Picture 3"/>
-            <wp:cNvGraphicFramePr>
-              <a:graphicFrameLocks noChangeAspect="1"/>
-            </wp:cNvGraphicFramePr>
-            <a:graphic>
-              <a:graphicData uri="http://schemas.openxmlformats.org/drawingml/2006/picture">
-                <pic:pic>
-                  <pic:nvPicPr>
-                    <pic:cNvPr id="0" name="03-login-success-empty.png"/>
-                    <pic:cNvPicPr/>
-                  </pic:nvPicPr>
-                  <pic:blipFill>
-                    <a:blip r:embed="rId10"/>
-                    <a:stretch>
-                      <a:fillRect/>
-                    </a:stretch>
-                  </pic:blipFill>
-                  <pic:spPr>
-                    <a:xfrm>
-                      <a:off x="0" y="0"/>
-                      <a:ext cx="5897880" cy="6681192"/>
-                    </a:xfrm>
-                    <a:prstGeom prst="rect"/>
-                  </pic:spPr>
-                </pic:pic>
-              </a:graphicData>
-            </a:graphic>
-          </wp:inline>
-        </w:drawing>
-      </w:r>
-    </w:p>
-    <w:p>
-      <w:pPr>
-        <w:jc w:val="center"/>
-      </w:pPr>
-      <w:r>
-        <w:rPr>
-          <w:i/>
-          <w:sz w:val="18"/>
-        </w:rPr>
-        <w:t>Ảnh chụp giao diện prototype: docs/screenshots/03-login-success-empty.png</w:t>
-      </w:r>
-    </w:p>
-    <w:p>
-      <w:r>
-        <w:br w:type="page"/>
-      </w:r>
-    </w:p>
-    <w:p>
-      <w:pPr>
-        <w:pStyle w:val="Heading1"/>
-      </w:pPr>
-      <w:r>
-        <w:t>4. Đang xử lý yêu cầu phân loại</w:t>
-      </w:r>
-    </w:p>
-    <w:p>
-      <w:r>
-        <w:t>Trong khi chờ phản hồi API, giao diện hiển thị trạng thái đang gửi và khóa nút thao tác.</w:t>
-      </w:r>
-    </w:p>
-    <w:p>
-      <w:r>
-        <w:drawing>
-          <wp:inline xmlns:a="http://schemas.openxmlformats.org/drawingml/2006/main" xmlns:pic="http://schemas.openxmlformats.org/drawingml/2006/picture">
-            <wp:extent cx="5897880" cy="6681192"/>
-            <wp:docPr id="4" name="Picture 4"/>
-            <wp:cNvGraphicFramePr>
-              <a:graphicFrameLocks noChangeAspect="1"/>
-            </wp:cNvGraphicFramePr>
-            <a:graphic>
-              <a:graphicData uri="http://schemas.openxmlformats.org/drawingml/2006/picture">
-                <pic:pic>
-                  <pic:nvPicPr>
-                    <pic:cNvPr id="0" name="04-classification-loading.png"/>
-                    <pic:cNvPicPr/>
-                  </pic:nvPicPr>
-                  <pic:blipFill>
-                    <a:blip r:embed="rId11"/>
-                    <a:stretch>
-                      <a:fillRect/>
-                    </a:stretch>
-                  </pic:blipFill>
-                  <pic:spPr>
-                    <a:xfrm>
-                      <a:off x="0" y="0"/>
-                      <a:ext cx="5897880" cy="6681192"/>
-                    </a:xfrm>
-                    <a:prstGeom prst="rect"/>
-                  </pic:spPr>
-                </pic:pic>
-              </a:graphicData>
-            </a:graphic>
-          </wp:inline>
-        </w:drawing>
-      </w:r>
-    </w:p>
-    <w:p>
-      <w:pPr>
-        <w:jc w:val="center"/>
-      </w:pPr>
-      <w:r>
-        <w:rPr>
-          <w:i/>
-          <w:sz w:val="18"/>
-        </w:rPr>
-        <w:t>Ảnh chụp giao diện prototype: docs/screenshots/04-classification-loading.png</w:t>
-      </w:r>
-    </w:p>
-    <w:p>
-      <w:r>
-        <w:br w:type="page"/>
-      </w:r>
-    </w:p>
-    <w:p>
-      <w:pPr>
-        <w:pStyle w:val="Heading1"/>
-      </w:pPr>
-      <w:r>
-        <w:t>5. Phân loại thành công</w:t>
-      </w:r>
-    </w:p>
-    <w:p>
-      <w:r>
-        <w:t>Mô tả “Máy sạc không vào, cắm sạc báo lỗi phụ kiện” trả đề xuất SAC, ưu tiên TRUNG_BINH.</w:t>
-      </w:r>
-    </w:p>
-    <w:p>
-      <w:r>
-        <w:drawing>
-          <wp:inline xmlns:a="http://schemas.openxmlformats.org/drawingml/2006/main" xmlns:pic="http://schemas.openxmlformats.org/drawingml/2006/picture">
-            <wp:extent cx="5897880" cy="6681192"/>
-            <wp:docPr id="5" name="Picture 5"/>
-            <wp:cNvGraphicFramePr>
-              <a:graphicFrameLocks noChangeAspect="1"/>
-            </wp:cNvGraphicFramePr>
-            <a:graphic>
-              <a:graphicData uri="http://schemas.openxmlformats.org/drawingml/2006/picture">
-                <pic:pic>
-                  <pic:nvPicPr>
-                    <pic:cNvPr id="0" name="05-classification-success.png"/>
-                    <pic:cNvPicPr/>
-                  </pic:nvPicPr>
-                  <pic:blipFill>
-                    <a:blip r:embed="rId12"/>
-                    <a:stretch>
-                      <a:fillRect/>
-                    </a:stretch>
-                  </pic:blipFill>
-                  <pic:spPr>
-                    <a:xfrm>
-                      <a:off x="0" y="0"/>
-                      <a:ext cx="5897880" cy="6681192"/>
-                    </a:xfrm>
-                    <a:prstGeom prst="rect"/>
-                  </pic:spPr>
-                </pic:pic>
-              </a:graphicData>
-            </a:graphic>
-          </wp:inline>
-        </w:drawing>
-      </w:r>
-    </w:p>
-    <w:p>
-      <w:pPr>
-        <w:jc w:val="center"/>
-      </w:pPr>
-      <w:r>
-        <w:rPr>
-          <w:i/>
-          <w:sz w:val="18"/>
-        </w:rPr>
-        <w:t>Ảnh chụp giao diện prototype: docs/screenshots/05-classification-success.png</w:t>
-      </w:r>
-    </w:p>
-    <w:p>
-      <w:r>
-        <w:br w:type="page"/>
-      </w:r>
-    </w:p>
-    <w:p>
-      <w:pPr>
-        <w:pStyle w:val="Heading1"/>
-      </w:pPr>
-      <w:r>
-        <w:t>6. Mô tả không hợp lệ</w:t>
-      </w:r>
-    </w:p>
-    <w:p>
-      <w:r>
-        <w:t>Mô tả ngắn bị từ chối và giao diện hiển thị phản hồi lỗi validation.</w:t>
-      </w:r>
-    </w:p>
-    <w:p>
-      <w:r>
-        <w:drawing>
-          <wp:inline xmlns:a="http://schemas.openxmlformats.org/drawingml/2006/main" xmlns:pic="http://schemas.openxmlformats.org/drawingml/2006/picture">
-            <wp:extent cx="5897880" cy="6681192"/>
-            <wp:docPr id="6" name="Picture 6"/>
-            <wp:cNvGraphicFramePr>
-              <a:graphicFrameLocks noChangeAspect="1"/>
-            </wp:cNvGraphicFramePr>
-            <a:graphic>
-              <a:graphicData uri="http://schemas.openxmlformats.org/drawingml/2006/picture">
-                <pic:pic>
-                  <pic:nvPicPr>
-                    <pic:cNvPr id="0" name="06-classification-error.png"/>
-                    <pic:cNvPicPr/>
-                  </pic:nvPicPr>
-                  <pic:blipFill>
-                    <a:blip r:embed="rId13"/>
-                    <a:stretch>
-                      <a:fillRect/>
-                    </a:stretch>
-                  </pic:blipFill>
-                  <pic:spPr>
-                    <a:xfrm>
-                      <a:off x="0" y="0"/>
-                      <a:ext cx="5897880" cy="6681192"/>
-                    </a:xfrm>
-                    <a:prstGeom prst="rect"/>
-                  </pic:spPr>
-                </pic:pic>
-              </a:graphicData>
-            </a:graphic>
-          </wp:inline>
-        </w:drawing>
-      </w:r>
-    </w:p>
-    <w:p>
-      <w:pPr>
-        <w:jc w:val="center"/>
-      </w:pPr>
-      <w:r>
-        <w:rPr>
-          <w:i/>
-          <w:sz w:val="18"/>
-        </w:rPr>
-        <w:t>Ảnh chụp giao diện prototype: docs/screenshots/06-classification-error.png</w:t>
-      </w:r>
-    </w:p>
-    <w:p>
-      <w:r>
-        <w:br w:type="page"/>
-      </w:r>
-    </w:p>
-    <w:p>
-      <w:pPr>
-        <w:pStyle w:val="Heading1"/>
-      </w:pPr>
-      <w:r>
-        <w:t>7. Đăng xuất</w:t>
-      </w:r>
-    </w:p>
-    <w:p>
-      <w:r>
-        <w:t>Đăng xuất xóa phiên trình duyệt và đưa người dùng về màn hình đăng nhập.</w:t>
-      </w:r>
-    </w:p>
-    <w:p>
-      <w:r>
-        <w:drawing>
-          <wp:inline xmlns:a="http://schemas.openxmlformats.org/drawingml/2006/main" xmlns:pic="http://schemas.openxmlformats.org/drawingml/2006/picture">
-            <wp:extent cx="5897880" cy="6516631"/>
-            <wp:docPr id="7" name="Picture 7"/>
-            <wp:cNvGraphicFramePr>
-              <a:graphicFrameLocks noChangeAspect="1"/>
-            </wp:cNvGraphicFramePr>
-            <a:graphic>
-              <a:graphicData uri="http://schemas.openxmlformats.org/drawingml/2006/picture">
-                <pic:pic>
-                  <pic:nvPicPr>
-                    <pic:cNvPr id="0" name="07-logout.png"/>
-                    <pic:cNvPicPr/>
-                  </pic:nvPicPr>
-                  <pic:blipFill>
-                    <a:blip r:embed="rId14"/>
-                    <a:stretch>
-                      <a:fillRect/>
-                    </a:stretch>
-                  </pic:blipFill>
-                  <pic:spPr>
-                    <a:xfrm>
-                      <a:off x="0" y="0"/>
-                      <a:ext cx="5897880" cy="6516631"/>
-                    </a:xfrm>
-                    <a:prstGeom prst="rect"/>
-                  </pic:spPr>
-                </pic:pic>
-              </a:graphicData>
-            </a:graphic>
-          </wp:inline>
-        </w:drawing>
-      </w:r>
-    </w:p>
-    <w:p>
-      <w:pPr>
-        <w:jc w:val="center"/>
-      </w:pPr>
-      <w:r>
-        <w:rPr>
-          <w:i/>
-          <w:sz w:val="18"/>
-        </w:rPr>
-        <w:t>Ảnh chụp giao diện prototype: docs/screenshots/07-logout.png</w:t>
+        <w:t>Ảnh chụp prototype cục bộ: docs/screenshots/07-logout.png</w:t>
       </w:r>
     </w:p>
     <w:sectPr>
@@ -598,7 +603,7 @@
       <w:jc w:val="center"/>
     </w:pPr>
     <w:r>
-      <w:t>Smart CRM – Minh chứng luồng prototype</w:t>
+      <w:t>Smart CRM – Minh chứng luồng prototype | 24/10/2026</w:t>
     </w:r>
   </w:p>
 </w:ftr>

</xml_diff>